<commit_message>
Remove the Approval signature table from all HSE procedures
Remove the cover "Approval" heading and the Prepared By / Reviewed By /
Approved By signature table from all 50 operational and construction
procedures (01-DAN-PRC-HSE-*). The Document Control table, cover branding,
table of contents and body content are unchanged; each file re-validated.

Co-Authored-By: Claude Opus 4.8 <noreply@anthropic.com>
Claude-Session: https://claude.ai/code/session_01Gkd3K8tDngLcQLDrM4dcJc
</commit_message>
<xml_diff>
--- a/New HSSE Management System 2026/00-Governance/01-DAN-PRC-HSE-000050GLOSSARY__Jun_2026_REV01_Glossary.docx
+++ b/New HSSE Management System 2026/00-Governance/01-DAN-PRC-HSE-000050GLOSSARY__Jun_2026_REV01_Glossary.docx
@@ -629,266 +629,6 @@
                 <w:szCs w:val="18"/>
               </w:rPr>
               <w:t xml:space="preserve">US Letter</w:t>
-            </w:r>
-          </w:p>
-        </w:tc>
-      </w:tr>
-    </w:tbl>
-    <w:p>
-      <w:pPr>
-        <w:spacing w:after="80" w:before="360"/>
-      </w:pPr>
-      <w:r>
-        <w:rPr>
-          <w:rFonts w:ascii="Tahoma" w:cs="Tahoma" w:eastAsia="Tahoma" w:hAnsi="Tahoma"/>
-          <w:b/>
-          <w:bCs/>
-          <w:color w:val="542A12"/>
-          <w:sz w:val="22"/>
-          <w:szCs w:val="22"/>
-        </w:rPr>
-        <w:t xml:space="preserve">Approval</w:t>
-      </w:r>
-    </w:p>
-    <w:tbl>
-      <w:tblPr>
-        <w:tblW w:type="dxa" w:w="9360"/>
-        <w:tblBorders>
-          <w:top w:val="single" w:color="auto" w:sz="4"/>
-          <w:left w:val="single" w:color="auto" w:sz="4"/>
-          <w:bottom w:val="single" w:color="auto" w:sz="4"/>
-          <w:right w:val="single" w:color="auto" w:sz="4"/>
-          <w:insideH w:val="single" w:color="auto" w:sz="4"/>
-          <w:insideV w:val="single" w:color="auto" w:sz="4"/>
-        </w:tblBorders>
-      </w:tblPr>
-      <w:tblGrid>
-        <w:gridCol w:w="3120"/>
-        <w:gridCol w:w="3120"/>
-        <w:gridCol w:w="3120"/>
-      </w:tblGrid>
-      <w:tr>
-        <w:tc>
-          <w:tcPr>
-            <w:tcW w:type="dxa" w:w="3120"/>
-            <w:tcBorders>
-              <w:top w:val="single" w:color="BFB3AA" w:sz="4"/>
-              <w:left w:val="single" w:color="BFB3AA" w:sz="4"/>
-              <w:bottom w:val="single" w:color="BFB3AA" w:sz="4"/>
-              <w:right w:val="single" w:color="BFB3AA" w:sz="4"/>
-            </w:tcBorders>
-            <w:shd w:fill="EFE7E1" w:color="auto" w:val="clear"/>
-            <w:tcMar>
-              <w:top w:type="dxa" w:w="60"/>
-              <w:left w:type="dxa" w:w="120"/>
-              <w:bottom w:type="dxa" w:w="60"/>
-              <w:right w:type="dxa" w:w="120"/>
-            </w:tcMar>
-            <w:vAlign w:val="center"/>
-          </w:tcPr>
-          <w:p>
-            <w:r>
-              <w:rPr>
-                <w:rFonts w:ascii="Tahoma" w:cs="Tahoma" w:eastAsia="Tahoma" w:hAnsi="Tahoma"/>
-                <w:b/>
-                <w:bCs/>
-                <w:color w:val="542A12"/>
-                <w:sz w:val="18"/>
-                <w:szCs w:val="18"/>
-              </w:rPr>
-              <w:t xml:space="preserve">Prepared By</w:t>
-            </w:r>
-          </w:p>
-        </w:tc>
-        <w:tc>
-          <w:tcPr>
-            <w:tcW w:type="dxa" w:w="3120"/>
-            <w:tcBorders>
-              <w:top w:val="single" w:color="BFB3AA" w:sz="4"/>
-              <w:left w:val="single" w:color="BFB3AA" w:sz="4"/>
-              <w:bottom w:val="single" w:color="BFB3AA" w:sz="4"/>
-              <w:right w:val="single" w:color="BFB3AA" w:sz="4"/>
-            </w:tcBorders>
-            <w:shd w:fill="EFE7E1" w:color="auto" w:val="clear"/>
-            <w:tcMar>
-              <w:top w:type="dxa" w:w="60"/>
-              <w:left w:type="dxa" w:w="120"/>
-              <w:bottom w:type="dxa" w:w="60"/>
-              <w:right w:type="dxa" w:w="120"/>
-            </w:tcMar>
-            <w:vAlign w:val="center"/>
-          </w:tcPr>
-          <w:p>
-            <w:r>
-              <w:rPr>
-                <w:rFonts w:ascii="Tahoma" w:cs="Tahoma" w:eastAsia="Tahoma" w:hAnsi="Tahoma"/>
-                <w:b/>
-                <w:bCs/>
-                <w:color w:val="542A12"/>
-                <w:sz w:val="18"/>
-                <w:szCs w:val="18"/>
-              </w:rPr>
-              <w:t xml:space="preserve">Reviewed By</w:t>
-            </w:r>
-          </w:p>
-        </w:tc>
-        <w:tc>
-          <w:tcPr>
-            <w:tcW w:type="dxa" w:w="3120"/>
-            <w:tcBorders>
-              <w:top w:val="single" w:color="BFB3AA" w:sz="4"/>
-              <w:left w:val="single" w:color="BFB3AA" w:sz="4"/>
-              <w:bottom w:val="single" w:color="BFB3AA" w:sz="4"/>
-              <w:right w:val="single" w:color="BFB3AA" w:sz="4"/>
-            </w:tcBorders>
-            <w:shd w:fill="EFE7E1" w:color="auto" w:val="clear"/>
-            <w:tcMar>
-              <w:top w:type="dxa" w:w="60"/>
-              <w:left w:type="dxa" w:w="120"/>
-              <w:bottom w:type="dxa" w:w="60"/>
-              <w:right w:type="dxa" w:w="120"/>
-            </w:tcMar>
-            <w:vAlign w:val="center"/>
-          </w:tcPr>
-          <w:p>
-            <w:r>
-              <w:rPr>
-                <w:rFonts w:ascii="Tahoma" w:cs="Tahoma" w:eastAsia="Tahoma" w:hAnsi="Tahoma"/>
-                <w:b/>
-                <w:bCs/>
-                <w:color w:val="542A12"/>
-                <w:sz w:val="18"/>
-                <w:szCs w:val="18"/>
-              </w:rPr>
-              <w:t xml:space="preserve">Approved By</w:t>
-            </w:r>
-          </w:p>
-        </w:tc>
-      </w:tr>
-      <w:tr>
-        <w:tc>
-          <w:tcPr>
-            <w:tcW w:type="dxa" w:w="3120"/>
-            <w:tcBorders>
-              <w:top w:val="single" w:color="BFB3AA" w:sz="4"/>
-              <w:left w:val="single" w:color="BFB3AA" w:sz="4"/>
-              <w:bottom w:val="single" w:color="BFB3AA" w:sz="4"/>
-              <w:right w:val="single" w:color="BFB3AA" w:sz="4"/>
-            </w:tcBorders>
-            <w:tcMar>
-              <w:top w:type="dxa" w:w="200"/>
-              <w:left w:type="dxa" w:w="120"/>
-              <w:bottom w:type="dxa" w:w="200"/>
-              <w:right w:type="dxa" w:w="120"/>
-            </w:tcMar>
-          </w:tcPr>
-          <w:p>
-            <w:pPr>
-              <w:spacing w:after="240"/>
-            </w:pPr>
-            <w:r>
-              <w:rPr>
-                <w:rFonts w:ascii="Tahoma" w:cs="Tahoma" w:eastAsia="Tahoma" w:hAnsi="Tahoma"/>
-                <w:color w:val="595959"/>
-                <w:sz w:val="16"/>
-                <w:szCs w:val="16"/>
-              </w:rPr>
-              <w:t xml:space="preserve">HSE Representative</w:t>
-            </w:r>
-          </w:p>
-          <w:p>
-            <w:r>
-              <w:rPr>
-                <w:rFonts w:ascii="Tahoma" w:cs="Tahoma" w:eastAsia="Tahoma" w:hAnsi="Tahoma"/>
-                <w:color w:val="A0A0A0"/>
-                <w:sz w:val="14"/>
-                <w:szCs w:val="14"/>
-              </w:rPr>
-              <w:t xml:space="preserve">Signature / Date</w:t>
-            </w:r>
-          </w:p>
-        </w:tc>
-        <w:tc>
-          <w:tcPr>
-            <w:tcW w:type="dxa" w:w="3120"/>
-            <w:tcBorders>
-              <w:top w:val="single" w:color="BFB3AA" w:sz="4"/>
-              <w:left w:val="single" w:color="BFB3AA" w:sz="4"/>
-              <w:bottom w:val="single" w:color="BFB3AA" w:sz="4"/>
-              <w:right w:val="single" w:color="BFB3AA" w:sz="4"/>
-            </w:tcBorders>
-            <w:tcMar>
-              <w:top w:type="dxa" w:w="200"/>
-              <w:left w:type="dxa" w:w="120"/>
-              <w:bottom w:type="dxa" w:w="200"/>
-              <w:right w:type="dxa" w:w="120"/>
-            </w:tcMar>
-          </w:tcPr>
-          <w:p>
-            <w:pPr>
-              <w:spacing w:after="240"/>
-            </w:pPr>
-            <w:r>
-              <w:rPr>
-                <w:rFonts w:ascii="Tahoma" w:cs="Tahoma" w:eastAsia="Tahoma" w:hAnsi="Tahoma"/>
-                <w:color w:val="595959"/>
-                <w:sz w:val="16"/>
-                <w:szCs w:val="16"/>
-              </w:rPr>
-              <w:t xml:space="preserve">Competent Person (HSE)</w:t>
-            </w:r>
-          </w:p>
-          <w:p>
-            <w:r>
-              <w:rPr>
-                <w:rFonts w:ascii="Tahoma" w:cs="Tahoma" w:eastAsia="Tahoma" w:hAnsi="Tahoma"/>
-                <w:color w:val="A0A0A0"/>
-                <w:sz w:val="14"/>
-                <w:szCs w:val="14"/>
-              </w:rPr>
-              <w:t xml:space="preserve">Signature / Date</w:t>
-            </w:r>
-          </w:p>
-        </w:tc>
-        <w:tc>
-          <w:tcPr>
-            <w:tcW w:type="dxa" w:w="3120"/>
-            <w:tcBorders>
-              <w:top w:val="single" w:color="BFB3AA" w:sz="4"/>
-              <w:left w:val="single" w:color="BFB3AA" w:sz="4"/>
-              <w:bottom w:val="single" w:color="BFB3AA" w:sz="4"/>
-              <w:right w:val="single" w:color="BFB3AA" w:sz="4"/>
-            </w:tcBorders>
-            <w:tcMar>
-              <w:top w:type="dxa" w:w="200"/>
-              <w:left w:type="dxa" w:w="120"/>
-              <w:bottom w:type="dxa" w:w="200"/>
-              <w:right w:type="dxa" w:w="120"/>
-            </w:tcMar>
-          </w:tcPr>
-          <w:p>
-            <w:pPr>
-              <w:spacing w:after="240"/>
-            </w:pPr>
-            <w:r>
-              <w:rPr>
-                <w:rFonts w:ascii="Tahoma" w:cs="Tahoma" w:eastAsia="Tahoma" w:hAnsi="Tahoma"/>
-                <w:color w:val="595959"/>
-                <w:sz w:val="16"/>
-                <w:szCs w:val="16"/>
-              </w:rPr>
-              <w:t xml:space="preserve">Project Director / Manager</w:t>
-            </w:r>
-          </w:p>
-          <w:p>
-            <w:r>
-              <w:rPr>
-                <w:rFonts w:ascii="Tahoma" w:cs="Tahoma" w:eastAsia="Tahoma" w:hAnsi="Tahoma"/>
-                <w:color w:val="A0A0A0"/>
-                <w:sz w:val="14"/>
-                <w:szCs w:val="14"/>
-              </w:rPr>
-              <w:t xml:space="preserve">Signature / Date</w:t>
             </w:r>
           </w:p>
         </w:tc>

</xml_diff>